<commit_message>
Actualiza el manual: agrega la linea de montaje (roles) y la memoria
Nuevas secciones 6 (como trabaja el agente por dentro: las 8 estaciones + el orquestador) y 7 (la memoria por senales, cajas y repisa). Renumera y agrega glosario (orquestador, senal).
</commit_message>
<xml_diff>
--- a/Manual-Estandar-Agente.docx
+++ b/Manual-Estandar-Agente.docx
@@ -1501,7 +1501,667 @@
         <w:rPr>
           <w:color w:val="1F3A5F"/>
         </w:rPr>
-        <w:t>6. Qué hace el agente, y qué nunca hace</w:t>
+        <w:t>6. Cómo trabaja el agente por dentro: la línea de montaje</w:t>
+      </w:r>
+    </w:p>
+    <w:p>
+      <w:pPr>
+        <w:spacing w:after="120"/>
+      </w:pPr>
+      <w:r>
+        <w:rPr>
+          <w:b w:val="0"/>
+          <w:i w:val="0"/>
+          <w:sz w:val="22"/>
+        </w:rPr>
+        <w:t>El agente no hace todo de un tirón. Trabaja como una fábrica: el trabajo pasa por estaciones, cada una hace una parte, y entre una y otra hay un control de calidad. Nada avanza a la siguiente estación si no pasa el control.</w:t>
+      </w:r>
+    </w:p>
+    <w:tbl>
+      <w:tblPr>
+        <w:tblStyle w:val="LightGrid-Accent1"/>
+        <w:tblW w:type="auto" w:w="0"/>
+        <w:jc w:val="center"/>
+        <w:tblLook w:firstColumn="1" w:firstRow="1" w:lastColumn="0" w:lastRow="0" w:noHBand="0" w:noVBand="1" w:val="04A0"/>
+      </w:tblPr>
+      <w:tblGrid>
+        <w:gridCol w:w="2880"/>
+        <w:gridCol w:w="2880"/>
+        <w:gridCol w:w="2880"/>
+      </w:tblGrid>
+      <w:tr>
+        <w:tc>
+          <w:tcPr>
+            <w:tcW w:type="dxa" w:w="2160"/>
+            <w:shd w:val="clear" w:fill="1F3A5F"/>
+          </w:tcPr>
+          <w:p>
+            <w:r/>
+            <w:r>
+              <w:rPr>
+                <w:b/>
+                <w:color w:val="FFFFFF"/>
+                <w:sz w:val="20"/>
+              </w:rPr>
+              <w:t>Estación</w:t>
+            </w:r>
+          </w:p>
+        </w:tc>
+        <w:tc>
+          <w:tcPr>
+            <w:tcW w:type="dxa" w:w="5040"/>
+            <w:shd w:val="clear" w:fill="1F3A5F"/>
+          </w:tcPr>
+          <w:p>
+            <w:r/>
+            <w:r>
+              <w:rPr>
+                <w:b/>
+                <w:color w:val="FFFFFF"/>
+                <w:sz w:val="20"/>
+              </w:rPr>
+              <w:t>Qué hace</w:t>
+            </w:r>
+          </w:p>
+        </w:tc>
+        <w:tc>
+          <w:tcPr>
+            <w:tcW w:type="dxa" w:w="2160"/>
+            <w:shd w:val="clear" w:fill="1F3A5F"/>
+          </w:tcPr>
+          <w:p>
+            <w:r/>
+            <w:r>
+              <w:rPr>
+                <w:b/>
+                <w:color w:val="FFFFFF"/>
+                <w:sz w:val="20"/>
+              </w:rPr>
+              <w:t>¿Aprueba el usuario?</w:t>
+            </w:r>
+          </w:p>
+        </w:tc>
+      </w:tr>
+      <w:tr>
+        <w:tc>
+          <w:tcPr>
+            <w:tcW w:type="dxa" w:w="2160"/>
+          </w:tcPr>
+          <w:p>
+            <w:r/>
+            <w:r>
+              <w:rPr>
+                <w:sz w:val="19"/>
+              </w:rPr>
+              <w:t>1. Explorar</w:t>
+            </w:r>
+          </w:p>
+        </w:tc>
+        <w:tc>
+          <w:tcPr>
+            <w:tcW w:type="dxa" w:w="5040"/>
+          </w:tcPr>
+          <w:p>
+            <w:r/>
+            <w:r>
+              <w:rPr>
+                <w:sz w:val="19"/>
+              </w:rPr>
+              <w:t>Mira qué ya existe en el proyecto</w:t>
+            </w:r>
+          </w:p>
+        </w:tc>
+        <w:tc>
+          <w:tcPr>
+            <w:tcW w:type="dxa" w:w="2160"/>
+          </w:tcPr>
+          <w:p>
+            <w:r/>
+            <w:r>
+              <w:rPr>
+                <w:sz w:val="19"/>
+              </w:rPr>
+              <w:t>—</w:t>
+            </w:r>
+          </w:p>
+        </w:tc>
+      </w:tr>
+      <w:tr>
+        <w:tc>
+          <w:tcPr>
+            <w:tcW w:type="dxa" w:w="2160"/>
+          </w:tcPr>
+          <w:p>
+            <w:r/>
+            <w:r>
+              <w:rPr>
+                <w:sz w:val="19"/>
+              </w:rPr>
+              <w:t>2. Proponer</w:t>
+            </w:r>
+          </w:p>
+        </w:tc>
+        <w:tc>
+          <w:tcPr>
+            <w:tcW w:type="dxa" w:w="5040"/>
+          </w:tcPr>
+          <w:p>
+            <w:r/>
+            <w:r>
+              <w:rPr>
+                <w:sz w:val="19"/>
+              </w:rPr>
+              <w:t>Define qué se va a hacer y qué no</w:t>
+            </w:r>
+          </w:p>
+        </w:tc>
+        <w:tc>
+          <w:tcPr>
+            <w:tcW w:type="dxa" w:w="2160"/>
+          </w:tcPr>
+          <w:p>
+            <w:r/>
+            <w:r>
+              <w:rPr>
+                <w:sz w:val="19"/>
+              </w:rPr>
+              <w:t>Sí · el alcance</w:t>
+            </w:r>
+          </w:p>
+        </w:tc>
+      </w:tr>
+      <w:tr>
+        <w:tc>
+          <w:tcPr>
+            <w:tcW w:type="dxa" w:w="2160"/>
+          </w:tcPr>
+          <w:p>
+            <w:r/>
+            <w:r>
+              <w:rPr>
+                <w:sz w:val="19"/>
+              </w:rPr>
+              <w:t>3. Especificar</w:t>
+            </w:r>
+          </w:p>
+        </w:tc>
+        <w:tc>
+          <w:tcPr>
+            <w:tcW w:type="dxa" w:w="5040"/>
+          </w:tcPr>
+          <w:p>
+            <w:r/>
+            <w:r>
+              <w:rPr>
+                <w:sz w:val="19"/>
+              </w:rPr>
+              <w:t>Escribe el acuerdo de diseño (la spec)</w:t>
+            </w:r>
+          </w:p>
+        </w:tc>
+        <w:tc>
+          <w:tcPr>
+            <w:tcW w:type="dxa" w:w="2160"/>
+          </w:tcPr>
+          <w:p>
+            <w:r/>
+            <w:r>
+              <w:rPr>
+                <w:sz w:val="19"/>
+              </w:rPr>
+              <w:t>Sí · la spec</w:t>
+            </w:r>
+          </w:p>
+        </w:tc>
+      </w:tr>
+      <w:tr>
+        <w:tc>
+          <w:tcPr>
+            <w:tcW w:type="dxa" w:w="2160"/>
+          </w:tcPr>
+          <w:p>
+            <w:r/>
+            <w:r>
+              <w:rPr>
+                <w:sz w:val="19"/>
+              </w:rPr>
+              <w:t>4. Diseñar</w:t>
+            </w:r>
+          </w:p>
+        </w:tc>
+        <w:tc>
+          <w:tcPr>
+            <w:tcW w:type="dxa" w:w="5040"/>
+          </w:tcPr>
+          <w:p>
+            <w:r/>
+            <w:r>
+              <w:rPr>
+                <w:sz w:val="19"/>
+              </w:rPr>
+              <w:t>Decide cómo se va a construir</w:t>
+            </w:r>
+          </w:p>
+        </w:tc>
+        <w:tc>
+          <w:tcPr>
+            <w:tcW w:type="dxa" w:w="2160"/>
+          </w:tcPr>
+          <w:p>
+            <w:r/>
+            <w:r>
+              <w:rPr>
+                <w:sz w:val="19"/>
+              </w:rPr>
+              <w:t>—</w:t>
+            </w:r>
+          </w:p>
+        </w:tc>
+      </w:tr>
+      <w:tr>
+        <w:tc>
+          <w:tcPr>
+            <w:tcW w:type="dxa" w:w="2160"/>
+          </w:tcPr>
+          <w:p>
+            <w:r/>
+            <w:r>
+              <w:rPr>
+                <w:sz w:val="19"/>
+              </w:rPr>
+              <w:t>5. Planificar</w:t>
+            </w:r>
+          </w:p>
+        </w:tc>
+        <w:tc>
+          <w:tcPr>
+            <w:tcW w:type="dxa" w:w="5040"/>
+          </w:tcPr>
+          <w:p>
+            <w:r/>
+            <w:r>
+              <w:rPr>
+                <w:sz w:val="19"/>
+              </w:rPr>
+              <w:t>Divide el trabajo en tareas ordenadas</w:t>
+            </w:r>
+          </w:p>
+        </w:tc>
+        <w:tc>
+          <w:tcPr>
+            <w:tcW w:type="dxa" w:w="2160"/>
+          </w:tcPr>
+          <w:p>
+            <w:r/>
+            <w:r>
+              <w:rPr>
+                <w:sz w:val="19"/>
+              </w:rPr>
+              <w:t>Sí · el plan</w:t>
+            </w:r>
+          </w:p>
+        </w:tc>
+      </w:tr>
+      <w:tr>
+        <w:tc>
+          <w:tcPr>
+            <w:tcW w:type="dxa" w:w="2160"/>
+          </w:tcPr>
+          <w:p>
+            <w:r/>
+            <w:r>
+              <w:rPr>
+                <w:sz w:val="19"/>
+              </w:rPr>
+              <w:t>6. Implementar</w:t>
+            </w:r>
+          </w:p>
+        </w:tc>
+        <w:tc>
+          <w:tcPr>
+            <w:tcW w:type="dxa" w:w="5040"/>
+          </w:tcPr>
+          <w:p>
+            <w:r/>
+            <w:r>
+              <w:rPr>
+                <w:sz w:val="19"/>
+              </w:rPr>
+              <w:t>Escribe el código y las pruebas</w:t>
+            </w:r>
+          </w:p>
+        </w:tc>
+        <w:tc>
+          <w:tcPr>
+            <w:tcW w:type="dxa" w:w="2160"/>
+          </w:tcPr>
+          <w:p>
+            <w:r/>
+            <w:r>
+              <w:rPr>
+                <w:sz w:val="19"/>
+              </w:rPr>
+              <w:t>—</w:t>
+            </w:r>
+          </w:p>
+        </w:tc>
+      </w:tr>
+      <w:tr>
+        <w:tc>
+          <w:tcPr>
+            <w:tcW w:type="dxa" w:w="2160"/>
+          </w:tcPr>
+          <w:p>
+            <w:r/>
+            <w:r>
+              <w:rPr>
+                <w:sz w:val="19"/>
+              </w:rPr>
+              <w:t>7. Verificar</w:t>
+            </w:r>
+          </w:p>
+        </w:tc>
+        <w:tc>
+          <w:tcPr>
+            <w:tcW w:type="dxa" w:w="5040"/>
+          </w:tcPr>
+          <w:p>
+            <w:r/>
+            <w:r>
+              <w:rPr>
+                <w:sz w:val="19"/>
+              </w:rPr>
+              <w:t>Corre las pruebas y revisa que cumpla lo acordado</w:t>
+            </w:r>
+          </w:p>
+        </w:tc>
+        <w:tc>
+          <w:tcPr>
+            <w:tcW w:type="dxa" w:w="2160"/>
+          </w:tcPr>
+          <w:p>
+            <w:r/>
+            <w:r>
+              <w:rPr>
+                <w:sz w:val="19"/>
+              </w:rPr>
+              <w:t>—</w:t>
+            </w:r>
+          </w:p>
+        </w:tc>
+      </w:tr>
+      <w:tr>
+        <w:tc>
+          <w:tcPr>
+            <w:tcW w:type="dxa" w:w="2160"/>
+          </w:tcPr>
+          <w:p>
+            <w:r/>
+            <w:r>
+              <w:rPr>
+                <w:sz w:val="19"/>
+              </w:rPr>
+              <w:t>8. Criticar</w:t>
+            </w:r>
+          </w:p>
+        </w:tc>
+        <w:tc>
+          <w:tcPr>
+            <w:tcW w:type="dxa" w:w="5040"/>
+          </w:tcPr>
+          <w:p>
+            <w:r/>
+            <w:r>
+              <w:rPr>
+                <w:sz w:val="19"/>
+              </w:rPr>
+              <w:t>Busca bugs y problemas de seguridad</w:t>
+            </w:r>
+          </w:p>
+        </w:tc>
+        <w:tc>
+          <w:tcPr>
+            <w:tcW w:type="dxa" w:w="2160"/>
+          </w:tcPr>
+          <w:p>
+            <w:r/>
+            <w:r>
+              <w:rPr>
+                <w:sz w:val="19"/>
+              </w:rPr>
+              <w:t>—</w:t>
+            </w:r>
+          </w:p>
+        </w:tc>
+      </w:tr>
+    </w:tbl>
+    <w:p>
+      <w:pPr>
+        <w:spacing w:after="120"/>
+      </w:pPr>
+    </w:p>
+    <w:p>
+      <w:pPr>
+        <w:spacing w:after="120"/>
+      </w:pPr>
+      <w:r>
+        <w:rPr>
+          <w:b w:val="0"/>
+          <w:i w:val="0"/>
+          <w:sz w:val="22"/>
+        </w:rPr>
+        <w:t>Un director (el "orquestador") llama a cada estación en orden, vigila los controles de calidad, y no deja avanzar si algo falla.</w:t>
+      </w:r>
+    </w:p>
+    <w:tbl>
+      <w:tblPr>
+        <w:tblW w:type="auto" w:w="0"/>
+        <w:jc w:val="center"/>
+        <w:tblLook w:firstColumn="1" w:firstRow="1" w:lastColumn="0" w:lastRow="0" w:noHBand="0" w:noVBand="1" w:val="04A0"/>
+      </w:tblPr>
+      <w:tblGrid>
+        <w:gridCol w:w="8640"/>
+      </w:tblGrid>
+      <w:tr>
+        <w:tc>
+          <w:tcPr>
+            <w:tcW w:type="dxa" w:w="9360"/>
+            <w:shd w:val="clear" w:fill="EAF0F8"/>
+          </w:tcPr>
+          <w:p>
+            <w:pPr>
+              <w:spacing w:after="40"/>
+            </w:pPr>
+            <w:r>
+              <w:rPr>
+                <w:b/>
+                <w:color w:val="1F3A5F"/>
+                <w:sz w:val="21"/>
+              </w:rPr>
+              <w:t>Lo importante</w:t>
+            </w:r>
+          </w:p>
+          <w:p>
+            <w:r>
+              <w:rPr>
+                <w:sz w:val="20"/>
+              </w:rPr>
+              <w:t>El agente se detiene y pide el OK del usuario en los momentos clave: el alcance, la spec, el plan, y antes de guardar o publicar. Lo demás lo hace de corrido.</w:t>
+            </w:r>
+          </w:p>
+        </w:tc>
+      </w:tr>
+    </w:tbl>
+    <w:p>
+      <w:pPr>
+        <w:spacing w:after="40"/>
+      </w:pPr>
+    </w:p>
+    <w:p>
+      <w:r>
+        <w:br w:type="page"/>
+      </w:r>
+    </w:p>
+    <w:p>
+      <w:pPr>
+        <w:pStyle w:val="Heading1"/>
+      </w:pPr>
+      <w:r>
+        <w:rPr>
+          <w:color w:val="1F3A5F"/>
+        </w:rPr>
+        <w:t>7. La memoria: lo que el agente recuerda</w:t>
+      </w:r>
+    </w:p>
+    <w:p>
+      <w:pPr>
+        <w:spacing w:after="120"/>
+      </w:pPr>
+      <w:r>
+        <w:rPr>
+          <w:b w:val="0"/>
+          <w:i w:val="0"/>
+          <w:sz w:val="22"/>
+        </w:rPr>
+        <w:t>El agente guarda las cosas importantes que van pasando y las puede consultar después. Así no vuelve a preguntar lo mismo ni repite un error que ya se resolvió.</w:t>
+      </w:r>
+    </w:p>
+    <w:p>
+      <w:pPr>
+        <w:spacing w:after="40"/>
+      </w:pPr>
+      <w:r>
+        <w:rPr>
+          <w:b/>
+          <w:i w:val="0"/>
+          <w:color w:val="1F3A5F"/>
+          <w:sz w:val="22"/>
+        </w:rPr>
+        <w:t>Guarda señales, no la conversación entera:</w:t>
+      </w:r>
+    </w:p>
+    <w:p>
+      <w:pPr>
+        <w:pStyle w:val="ListBullet"/>
+        <w:spacing w:after="60"/>
+      </w:pPr>
+      <w:r>
+        <w:t>Decisiones y por qué se tomaron.</w:t>
+      </w:r>
+    </w:p>
+    <w:p>
+      <w:pPr>
+        <w:pStyle w:val="ListBullet"/>
+        <w:spacing w:after="60"/>
+      </w:pPr>
+      <w:r>
+        <w:t>Errores que ya se resolvieron (para no repetirlos).</w:t>
+      </w:r>
+    </w:p>
+    <w:p>
+      <w:pPr>
+        <w:pStyle w:val="ListBullet"/>
+        <w:spacing w:after="60"/>
+      </w:pPr>
+      <w:r>
+        <w:t>Lecciones aprendidas y trampas del entorno.</w:t>
+      </w:r>
+    </w:p>
+    <w:p>
+      <w:pPr>
+        <w:spacing w:after="120"/>
+      </w:pPr>
+    </w:p>
+    <w:p>
+      <w:pPr>
+        <w:spacing w:after="80"/>
+      </w:pPr>
+      <w:r>
+        <w:rPr>
+          <w:b w:val="0"/>
+          <w:i w:val="0"/>
+          <w:sz w:val="22"/>
+        </w:rPr>
+        <w:t>La memoria es una sola, compartida por todos los proyectos, pero cada cosa sabe a dónde pertenece:</w:t>
+      </w:r>
+    </w:p>
+    <w:tbl>
+      <w:tblPr>
+        <w:tblW w:type="auto" w:w="0"/>
+        <w:jc w:val="center"/>
+        <w:tblLook w:firstColumn="1" w:firstRow="1" w:lastColumn="0" w:lastRow="0" w:noHBand="0" w:noVBand="1" w:val="04A0"/>
+      </w:tblPr>
+      <w:tblGrid>
+        <w:gridCol w:w="8640"/>
+      </w:tblGrid>
+      <w:tr>
+        <w:tc>
+          <w:tcPr>
+            <w:tcW w:type="dxa" w:w="9360"/>
+            <w:shd w:val="clear" w:fill="EAF0F8"/>
+          </w:tcPr>
+          <w:p>
+            <w:pPr>
+              <w:spacing w:after="40"/>
+            </w:pPr>
+            <w:r>
+              <w:rPr>
+                <w:b/>
+                <w:color w:val="1F3A5F"/>
+                <w:sz w:val="21"/>
+              </w:rPr>
+              <w:t>Cajas y una repisa común</w:t>
+            </w:r>
+          </w:p>
+          <w:p>
+            <w:r>
+              <w:rPr>
+                <w:sz w:val="20"/>
+              </w:rPr>
+              <w:t>Lo propio de un proyecto se queda en ese proyecto (su "caja"). Las lecciones que sirven para todo —por ejemplo, "nunca exponer claves"— suben a una "repisa" común y aparecen en cualquier proyecto, aunque sea de otro lenguaje.</w:t>
+            </w:r>
+          </w:p>
+        </w:tc>
+      </w:tr>
+    </w:tbl>
+    <w:p>
+      <w:pPr>
+        <w:spacing w:after="40"/>
+      </w:pPr>
+    </w:p>
+    <w:p>
+      <w:pPr>
+        <w:spacing w:after="120"/>
+      </w:pPr>
+    </w:p>
+    <w:p>
+      <w:pPr>
+        <w:spacing w:after="120"/>
+      </w:pPr>
+      <w:r>
+        <w:rPr>
+          <w:b w:val="0"/>
+          <w:i/>
+          <w:color w:val="555555"/>
+          <w:sz w:val="22"/>
+        </w:rPr>
+        <w:t>Ejemplo: si en un proyecto se aprende algo importante, semanas después, trabajando en otro proyecto distinto, el agente lo recuerda y evita repetir el error.</w:t>
+      </w:r>
+    </w:p>
+    <w:p>
+      <w:r>
+        <w:br w:type="page"/>
+      </w:r>
+    </w:p>
+    <w:p>
+      <w:pPr>
+        <w:pStyle w:val="Heading1"/>
+      </w:pPr>
+      <w:r>
+        <w:rPr>
+          <w:color w:val="1F3A5F"/>
+        </w:rPr>
+        <w:t>8. Qué hace el agente, y qué nunca hace</w:t>
       </w:r>
     </w:p>
     <w:p>
@@ -1689,7 +2349,7 @@
         <w:rPr>
           <w:color w:val="1F3A5F"/>
         </w:rPr>
-        <w:t>7. Por qué el estándar tiene "tres capas"</w:t>
+        <w:t>9. Por qué el estándar tiene "tres capas"</w:t>
       </w:r>
     </w:p>
     <w:p>
@@ -2092,6 +2752,46 @@
         <w:t>Un formulario con huecos que se llenan con los datos del proyecto.</w:t>
       </w:r>
     </w:p>
+    <w:p>
+      <w:pPr>
+        <w:spacing w:after="100"/>
+      </w:pPr>
+      <w:r>
+        <w:rPr>
+          <w:b/>
+          <w:i w:val="0"/>
+          <w:color w:val="1F3A5F"/>
+        </w:rPr>
+        <w:t xml:space="preserve">Orquestador: </w:t>
+      </w:r>
+      <w:r>
+        <w:rPr>
+          <w:b w:val="0"/>
+          <w:i w:val="0"/>
+        </w:rPr>
+        <w:t>El "director" que hace pasar el trabajo por las estaciones en orden y controla la calidad en cada una.</w:t>
+      </w:r>
+    </w:p>
+    <w:p>
+      <w:pPr>
+        <w:spacing w:after="100"/>
+      </w:pPr>
+      <w:r>
+        <w:rPr>
+          <w:b/>
+          <w:i w:val="0"/>
+          <w:color w:val="1F3A5F"/>
+        </w:rPr>
+        <w:t xml:space="preserve">Señal: </w:t>
+      </w:r>
+      <w:r>
+        <w:rPr>
+          <w:b w:val="0"/>
+          <w:i w:val="0"/>
+        </w:rPr>
+        <w:t>Un dato de valor que el agente guarda en su memoria: una decisión, un error resuelto, una lección.</w:t>
+      </w:r>
+    </w:p>
     <w:sectPr>
       <w:pgSz w:w="12240" w:h="15840"/>
       <w:pgMar w:top="1440" w:right="1800" w:bottom="1440" w:left="1800" w:header="720" w:footer="720" w:gutter="0"/>

</xml_diff>